<commit_message>
docs(report): format report and slides according to decree 30/2020/ND-CP and synchronize 39 user stories
</commit_message>
<xml_diff>
--- a/docs/Bao_Cao_Thuc_Tap_He_Thong_Dat_Lich_Salon_Spa.docx
+++ b/docs/Bao_Cao_Thuc_Tap_He_Thong_Dat_Lich_Salon_Spa.docx
@@ -1258,7 +1258,7 @@
         <w:pStyle w:val="Heading1"/>
         <w:rPr/>
       </w:pPr>
-      <w:bookmarkStart w:id="0" w:name="__RefHeading___Toc2777_2791007604"/>
+      <w:bookmarkStart w:id="0" w:name="__RefHeading___Toc2772_4087052617"/>
       <w:bookmarkEnd w:id="0"/>
       <w:r>
         <w:rPr>
@@ -1360,7 +1360,7 @@
         <w:pStyle w:val="Heading1"/>
         <w:rPr/>
       </w:pPr>
-      <w:bookmarkStart w:id="1" w:name="__RefHeading___Toc2779_2791007604"/>
+      <w:bookmarkStart w:id="1" w:name="__RefHeading___Toc2774_4087052617"/>
       <w:bookmarkEnd w:id="1"/>
       <w:r>
         <w:rPr>
@@ -1405,7 +1405,7 @@
             </w:rPr>
             <w:fldChar w:fldCharType="separate"/>
           </w:r>
-          <w:hyperlink w:anchor="__RefHeading___Toc2777_2791007604" w:tooltip="LỜI CẢM ƠN">
+          <w:hyperlink w:anchor="__RefHeading___Toc2772_4087052617" w:tooltip="LỜI CẢM ƠN">
             <w:r>
               <w:rPr>
                 <w:rStyle w:val="IndexLink"/>
@@ -1426,7 +1426,7 @@
             </w:tabs>
             <w:rPr/>
           </w:pPr>
-          <w:hyperlink w:anchor="__RefHeading___Toc2779_2791007604" w:tooltip="MỤC LỤC">
+          <w:hyperlink w:anchor="__RefHeading___Toc2774_4087052617" w:tooltip="MỤC LỤC">
             <w:r>
               <w:rPr>
                 <w:rStyle w:val="IndexLink"/>
@@ -1447,7 +1447,7 @@
             </w:tabs>
             <w:rPr/>
           </w:pPr>
-          <w:hyperlink w:anchor="__RefHeading___Toc2781_2791007604" w:tooltip="DANH MỤC TỪ VIẾT TẮT">
+          <w:hyperlink w:anchor="__RefHeading___Toc2776_4087052617" w:tooltip="DANH MỤC TỪ VIẾT TẮT">
             <w:r>
               <w:rPr>
                 <w:rStyle w:val="IndexLink"/>
@@ -1468,7 +1468,7 @@
             </w:tabs>
             <w:rPr/>
           </w:pPr>
-          <w:hyperlink w:anchor="__RefHeading___Toc2783_2791007604" w:tooltip="CHƯƠNG 1 TỔNG QUAN ĐỀ TÀI VÀ BÀI TOÁN THỰC TẾ">
+          <w:hyperlink w:anchor="__RefHeading___Toc2778_4087052617" w:tooltip="CHƯƠNG 1 TỔNG QUAN ĐỀ TÀI VÀ BÀI TOÁN THỰC TẾ">
             <w:r>
               <w:rPr>
                 <w:rStyle w:val="IndexLink"/>
@@ -1489,7 +1489,7 @@
             </w:tabs>
             <w:rPr/>
           </w:pPr>
-          <w:hyperlink w:anchor="__RefHeading___Toc2785_2791007604" w:tooltip="1.1. Lý do chọn đề tài">
+          <w:hyperlink w:anchor="__RefHeading___Toc2780_4087052617" w:tooltip="1.1. Lý do chọn đề tài">
             <w:r>
               <w:rPr>
                 <w:rStyle w:val="IndexLink"/>
@@ -1510,7 +1510,7 @@
             </w:tabs>
             <w:rPr/>
           </w:pPr>
-          <w:hyperlink w:anchor="__RefHeading___Toc2787_2791007604" w:tooltip="1.2. Mô hình salon – spa quy mô vừa">
+          <w:hyperlink w:anchor="__RefHeading___Toc2782_4087052617" w:tooltip="1.2. Mô hình salon – spa quy mô vừa">
             <w:r>
               <w:rPr>
                 <w:rStyle w:val="IndexLink"/>
@@ -1531,7 +1531,7 @@
             </w:tabs>
             <w:rPr/>
           </w:pPr>
-          <w:hyperlink w:anchor="__RefHeading___Toc2789_2791007604" w:tooltip="1.3. Những khó khăn khi quản lý thủ công">
+          <w:hyperlink w:anchor="__RefHeading___Toc2784_4087052617" w:tooltip="1.3. Những khó khăn khi quản lý thủ công">
             <w:r>
               <w:rPr>
                 <w:rStyle w:val="IndexLink"/>
@@ -1552,7 +1552,7 @@
             </w:tabs>
             <w:rPr/>
           </w:pPr>
-          <w:hyperlink w:anchor="__RefHeading___Toc2791_2791007604" w:tooltip="1.4. Mục tiêu của phần mềm">
+          <w:hyperlink w:anchor="__RefHeading___Toc2786_4087052617" w:tooltip="1.4. Mục tiêu của phần mềm">
             <w:r>
               <w:rPr>
                 <w:rStyle w:val="IndexLink"/>
@@ -1573,7 +1573,7 @@
             </w:tabs>
             <w:rPr/>
           </w:pPr>
-          <w:hyperlink w:anchor="__RefHeading___Toc2793_2791007604" w:tooltip="1.5. Đối tượng sử dụng và phạm vi">
+          <w:hyperlink w:anchor="__RefHeading___Toc2788_4087052617" w:tooltip="1.5. Đối tượng sử dụng và phạm vi">
             <w:r>
               <w:rPr>
                 <w:rStyle w:val="IndexLink"/>
@@ -1594,7 +1594,7 @@
             </w:tabs>
             <w:rPr/>
           </w:pPr>
-          <w:hyperlink w:anchor="__RefHeading___Toc2795_2791007604" w:tooltip="1.6. Công nghệ sử dụng">
+          <w:hyperlink w:anchor="__RefHeading___Toc2790_4087052617" w:tooltip="1.6. Công nghệ sử dụng">
             <w:r>
               <w:rPr>
                 <w:rStyle w:val="IndexLink"/>
@@ -1615,7 +1615,7 @@
             </w:tabs>
             <w:rPr/>
           </w:pPr>
-          <w:hyperlink w:anchor="__RefHeading___Toc2797_2791007604" w:tooltip="CHƯƠNG 2 PHÂN TÍCH YÊU CẦU VÀ QUY TRÌNH SCRUM">
+          <w:hyperlink w:anchor="__RefHeading___Toc2792_4087052617" w:tooltip="CHƯƠNG 2 PHÂN TÍCH YÊU CẦU VÀ QUY TRÌNH SCRUM">
             <w:r>
               <w:rPr>
                 <w:rStyle w:val="IndexLink"/>
@@ -1636,7 +1636,7 @@
             </w:tabs>
             <w:rPr/>
           </w:pPr>
-          <w:hyperlink w:anchor="__RefHeading___Toc2799_2791007604" w:tooltip="2.1. Quy trình Scrum áp dụng">
+          <w:hyperlink w:anchor="__RefHeading___Toc2794_4087052617" w:tooltip="2.1. Quy trình Scrum áp dụng">
             <w:r>
               <w:rPr>
                 <w:rStyle w:val="IndexLink"/>
@@ -1657,7 +1657,7 @@
             </w:tabs>
             <w:rPr/>
           </w:pPr>
-          <w:hyperlink w:anchor="__RefHeading___Toc2801_2791007604" w:tooltip="2.2. Product Backlog: 6 Epic, 39 User Story, 165 Story Point">
+          <w:hyperlink w:anchor="__RefHeading___Toc2796_4087052617" w:tooltip="2.2. Product Backlog: 6 Epic, 39 User Story, 165 Story Point">
             <w:r>
               <w:rPr>
                 <w:rStyle w:val="IndexLink"/>
@@ -1678,7 +1678,7 @@
             </w:tabs>
             <w:rPr/>
           </w:pPr>
-          <w:hyperlink w:anchor="__RefHeading___Toc2803_2791007604" w:tooltip="2.2.1. Danh sách 39 User Story">
+          <w:hyperlink w:anchor="__RefHeading___Toc2798_4087052617" w:tooltip="2.2.1. Danh sách 39 User Story">
             <w:r>
               <w:rPr>
                 <w:rStyle w:val="IndexLink"/>
@@ -1705,7 +1705,7 @@
             </w:tabs>
             <w:rPr/>
           </w:pPr>
-          <w:hyperlink w:anchor="__RefHeading___Toc2805_2791007604" w:tooltip="2.3. Kế hoạch bốn Sprint">
+          <w:hyperlink w:anchor="__RefHeading___Toc2800_4087052617" w:tooltip="2.3. Kế hoạch bốn Sprint">
             <w:r>
               <w:rPr>
                 <w:rStyle w:val="IndexLink"/>
@@ -1726,7 +1726,7 @@
             </w:tabs>
             <w:rPr/>
           </w:pPr>
-          <w:hyperlink w:anchor="__RefHeading___Toc2807_2791007604" w:tooltip="2.4. Ma trận phân công 10 thành viên">
+          <w:hyperlink w:anchor="__RefHeading___Toc2802_4087052617" w:tooltip="2.4. Ma trận phân công 10 thành viên">
             <w:r>
               <w:rPr>
                 <w:rStyle w:val="IndexLink"/>
@@ -1747,7 +1747,7 @@
             </w:tabs>
             <w:rPr/>
           </w:pPr>
-          <w:hyperlink w:anchor="__RefHeading___Toc2809_2791007604" w:tooltip="CHƯƠNG 3 THIẾT KẾ KIẾN TRÚC VÀ CƠ SỞ DỮ LIỆU">
+          <w:hyperlink w:anchor="__RefHeading___Toc2804_4087052617" w:tooltip="CHƯƠNG 3 THIẾT KẾ KIẾN TRÚC VÀ CƠ SỞ DỮ LIỆU">
             <w:r>
               <w:rPr>
                 <w:rStyle w:val="IndexLink"/>
@@ -1768,7 +1768,7 @@
             </w:tabs>
             <w:rPr/>
           </w:pPr>
-          <w:hyperlink w:anchor="__RefHeading___Toc2811_2791007604" w:tooltip="3.1. Kiến trúc tổng thể">
+          <w:hyperlink w:anchor="__RefHeading___Toc2806_4087052617" w:tooltip="3.1. Kiến trúc tổng thể">
             <w:r>
               <w:rPr>
                 <w:rStyle w:val="IndexLink"/>
@@ -1789,7 +1789,7 @@
             </w:tabs>
             <w:rPr/>
           </w:pPr>
-          <w:hyperlink w:anchor="__RefHeading___Toc2813_2791007604" w:tooltip="3.1.1. Backend phân tầng Controller – Service – Repository">
+          <w:hyperlink w:anchor="__RefHeading___Toc2808_4087052617" w:tooltip="3.1.1. Backend phân tầng Controller – Service – Repository">
             <w:r>
               <w:rPr>
                 <w:rStyle w:val="IndexLink"/>
@@ -1803,7 +1803,7 @@
                 <w:rStyle w:val="IndexLink"/>
               </w:rPr>
               <w:tab/>
-              <w:t>14</w:t>
+              <w:t>13</w:t>
             </w:r>
           </w:hyperlink>
         </w:p>
@@ -1816,7 +1816,7 @@
             </w:tabs>
             <w:rPr/>
           </w:pPr>
-          <w:hyperlink w:anchor="__RefHeading___Toc2815_2791007604" w:tooltip="3.1.2. Frontend React SPA theo phong cách Fresha">
+          <w:hyperlink w:anchor="__RefHeading___Toc2810_4087052617" w:tooltip="3.1.2. Frontend React SPA theo phong cách Fresha">
             <w:r>
               <w:rPr>
                 <w:rStyle w:val="IndexLink"/>
@@ -1830,7 +1830,7 @@
                 <w:rStyle w:val="IndexLink"/>
               </w:rPr>
               <w:tab/>
-              <w:t>15</w:t>
+              <w:t>14</w:t>
             </w:r>
           </w:hyperlink>
         </w:p>
@@ -1843,7 +1843,7 @@
             </w:tabs>
             <w:rPr/>
           </w:pPr>
-          <w:hyperlink w:anchor="__RefHeading___Toc2817_2791007604" w:tooltip="3.1.3. Bảo mật và phân quyền">
+          <w:hyperlink w:anchor="__RefHeading___Toc2812_4087052617" w:tooltip="3.1.3. Bảo mật và phân quyền">
             <w:r>
               <w:rPr>
                 <w:rStyle w:val="IndexLink"/>
@@ -1857,7 +1857,7 @@
                 <w:rStyle w:val="IndexLink"/>
               </w:rPr>
               <w:tab/>
-              <w:t>15</w:t>
+              <w:t>14</w:t>
             </w:r>
           </w:hyperlink>
         </w:p>
@@ -1870,7 +1870,7 @@
             </w:tabs>
             <w:rPr/>
           </w:pPr>
-          <w:hyperlink w:anchor="__RefHeading___Toc2819_2791007604" w:tooltip="3.2. Thiết kế cơ sở dữ liệu PostgreSQL">
+          <w:hyperlink w:anchor="__RefHeading___Toc2814_4087052617" w:tooltip="3.2. Thiết kế cơ sở dữ liệu PostgreSQL">
             <w:r>
               <w:rPr>
                 <w:rStyle w:val="IndexLink"/>
@@ -1878,7 +1878,7 @@
               </w:rPr>
               <w:t>3.2. Thiết kế cơ sở dữ liệu PostgreSQL</w:t>
               <w:tab/>
-              <w:t>16</w:t>
+              <w:t>15</w:t>
             </w:r>
           </w:hyperlink>
         </w:p>
@@ -1891,7 +1891,7 @@
             </w:tabs>
             <w:rPr/>
           </w:pPr>
-          <w:hyperlink w:anchor="__RefHeading___Toc2821_2791007604" w:tooltip="3.2.1. Ràng buộc toàn vẹn">
+          <w:hyperlink w:anchor="__RefHeading___Toc2816_4087052617" w:tooltip="3.2.1. Ràng buộc toàn vẹn">
             <w:r>
               <w:rPr>
                 <w:rStyle w:val="IndexLink"/>
@@ -1905,7 +1905,7 @@
                 <w:rStyle w:val="IndexLink"/>
               </w:rPr>
               <w:tab/>
-              <w:t>18</w:t>
+              <w:t>17</w:t>
             </w:r>
           </w:hyperlink>
         </w:p>
@@ -1918,7 +1918,7 @@
             </w:tabs>
             <w:rPr/>
           </w:pPr>
-          <w:hyperlink w:anchor="__RefHeading___Toc2823_2791007604" w:tooltip="3.2.2. Trigger">
+          <w:hyperlink w:anchor="__RefHeading___Toc2818_4087052617" w:tooltip="3.2.2. Trigger">
             <w:r>
               <w:rPr>
                 <w:rStyle w:val="IndexLink"/>
@@ -1932,7 +1932,7 @@
                 <w:rStyle w:val="IndexLink"/>
               </w:rPr>
               <w:tab/>
-              <w:t>19</w:t>
+              <w:t>18</w:t>
             </w:r>
           </w:hyperlink>
         </w:p>
@@ -1945,7 +1945,7 @@
             </w:tabs>
             <w:rPr/>
           </w:pPr>
-          <w:hyperlink w:anchor="__RefHeading___Toc2825_2791007604" w:tooltip="3.3. Giải thuật tính khung giờ trống 15 phút">
+          <w:hyperlink w:anchor="__RefHeading___Toc2820_4087052617" w:tooltip="3.3. Giải thuật tính khung giờ trống 15 phút">
             <w:r>
               <w:rPr>
                 <w:rStyle w:val="IndexLink"/>
@@ -1953,7 +1953,7 @@
               </w:rPr>
               <w:t>3.3. Giải thuật tính khung giờ trống 15 phút</w:t>
               <w:tab/>
-              <w:t>20</w:t>
+              <w:t>19</w:t>
             </w:r>
           </w:hyperlink>
         </w:p>
@@ -1966,7 +1966,7 @@
             </w:tabs>
             <w:rPr/>
           </w:pPr>
-          <w:hyperlink w:anchor="__RefHeading___Toc2827_2791007604" w:tooltip="3.4. Giải thuật chống đặt trùng lịch (Overbooking)">
+          <w:hyperlink w:anchor="__RefHeading___Toc2822_4087052617" w:tooltip="3.4. Giải thuật chống đặt trùng lịch (Overbooking)">
             <w:r>
               <w:rPr>
                 <w:rStyle w:val="IndexLink"/>
@@ -1974,7 +1974,7 @@
               </w:rPr>
               <w:t>3.4. Giải thuật chống đặt trùng lịch (Overbooking)</w:t>
               <w:tab/>
-              <w:t>20</w:t>
+              <w:t>19</w:t>
             </w:r>
           </w:hyperlink>
         </w:p>
@@ -1987,7 +1987,7 @@
             </w:tabs>
             <w:rPr/>
           </w:pPr>
-          <w:hyperlink w:anchor="__RefHeading___Toc2829_2791007604" w:tooltip="CHƯƠNG 4 CÀI ĐẶT VÀ HIỆN THỰC HỆ THỐNG">
+          <w:hyperlink w:anchor="__RefHeading___Toc2824_4087052617" w:tooltip="CHƯƠNG 4 CÀI ĐẶT VÀ HIỆN THỰC HỆ THỐNG">
             <w:r>
               <w:rPr>
                 <w:rStyle w:val="IndexLink"/>
@@ -1995,7 +1995,7 @@
               </w:rPr>
               <w:t>CHƯƠNG 4 CÀI ĐẶT VÀ HIỆN THỰC HỆ THỐNG</w:t>
               <w:tab/>
-              <w:t>22</w:t>
+              <w:t>21</w:t>
             </w:r>
           </w:hyperlink>
         </w:p>
@@ -2008,7 +2008,7 @@
             </w:tabs>
             <w:rPr/>
           </w:pPr>
-          <w:hyperlink w:anchor="__RefHeading___Toc2831_2791007604" w:tooltip="4.1. Tổng quan mã nguồn">
+          <w:hyperlink w:anchor="__RefHeading___Toc2826_4087052617" w:tooltip="4.1. Tổng quan mã nguồn">
             <w:r>
               <w:rPr>
                 <w:rStyle w:val="IndexLink"/>
@@ -2016,7 +2016,7 @@
               </w:rPr>
               <w:t>4.1. Tổng quan mã nguồn</w:t>
               <w:tab/>
-              <w:t>22</w:t>
+              <w:t>21</w:t>
             </w:r>
           </w:hyperlink>
         </w:p>
@@ -2029,7 +2029,7 @@
             </w:tabs>
             <w:rPr/>
           </w:pPr>
-          <w:hyperlink w:anchor="__RefHeading___Toc2833_2791007604" w:tooltip="4.2. Phân hệ Khách hàng – đặt lịch trực tuyến">
+          <w:hyperlink w:anchor="__RefHeading___Toc2828_4087052617" w:tooltip="4.2. Phân hệ Khách hàng – đặt lịch trực tuyến">
             <w:r>
               <w:rPr>
                 <w:rStyle w:val="IndexLink"/>
@@ -2037,7 +2037,7 @@
               </w:rPr>
               <w:t>4.2. Phân hệ Khách hàng – đặt lịch trực tuyến</w:t>
               <w:tab/>
-              <w:t>22</w:t>
+              <w:t>21</w:t>
             </w:r>
           </w:hyperlink>
         </w:p>
@@ -2050,7 +2050,7 @@
             </w:tabs>
             <w:rPr/>
           </w:pPr>
-          <w:hyperlink w:anchor="__RefHeading___Toc2835_2791007604" w:tooltip="4.3. Phân hệ Lễ tân – điều phối trong ngày">
+          <w:hyperlink w:anchor="__RefHeading___Toc2830_4087052617" w:tooltip="4.3. Phân hệ Lễ tân – điều phối trong ngày">
             <w:r>
               <w:rPr>
                 <w:rStyle w:val="IndexLink"/>
@@ -2058,7 +2058,7 @@
               </w:rPr>
               <w:t>4.3. Phân hệ Lễ tân – điều phối trong ngày</w:t>
               <w:tab/>
-              <w:t>24</w:t>
+              <w:t>23</w:t>
             </w:r>
           </w:hyperlink>
         </w:p>
@@ -2071,7 +2071,7 @@
             </w:tabs>
             <w:rPr/>
           </w:pPr>
-          <w:hyperlink w:anchor="__RefHeading___Toc2837_2791007604" w:tooltip="4.3.1. Lịch ngày dạng timeline 15 phút">
+          <w:hyperlink w:anchor="__RefHeading___Toc2832_4087052617" w:tooltip="4.3.1. Lịch ngày dạng timeline 15 phút">
             <w:r>
               <w:rPr>
                 <w:rStyle w:val="IndexLink"/>
@@ -2085,7 +2085,7 @@
                 <w:rStyle w:val="IndexLink"/>
               </w:rPr>
               <w:tab/>
-              <w:t>24</w:t>
+              <w:t>23</w:t>
             </w:r>
           </w:hyperlink>
         </w:p>
@@ -2098,7 +2098,7 @@
             </w:tabs>
             <w:rPr/>
           </w:pPr>
-          <w:hyperlink w:anchor="__RefHeading___Toc2839_2791007604" w:tooltip="4.3.2. Chờ xác nhận, khách vãng lai và check-in">
+          <w:hyperlink w:anchor="__RefHeading___Toc2834_4087052617" w:tooltip="4.3.2. Chờ xác nhận, khách vãng lai và check-in">
             <w:r>
               <w:rPr>
                 <w:rStyle w:val="IndexLink"/>
@@ -2112,7 +2112,7 @@
                 <w:rStyle w:val="IndexLink"/>
               </w:rPr>
               <w:tab/>
-              <w:t>25</w:t>
+              <w:t>24</w:t>
             </w:r>
           </w:hyperlink>
         </w:p>
@@ -2125,7 +2125,7 @@
             </w:tabs>
             <w:rPr/>
           </w:pPr>
-          <w:hyperlink w:anchor="__RefHeading___Toc2841_2791007604" w:tooltip="4.3.3. Chuyển lịch hàng loạt (Bulk Reassign)">
+          <w:hyperlink w:anchor="__RefHeading___Toc2836_4087052617" w:tooltip="4.3.3. Chuyển lịch hàng loạt (Bulk Reassign)">
             <w:r>
               <w:rPr>
                 <w:rStyle w:val="IndexLink"/>
@@ -2139,7 +2139,7 @@
                 <w:rStyle w:val="IndexLink"/>
               </w:rPr>
               <w:tab/>
-              <w:t>26</w:t>
+              <w:t>25</w:t>
             </w:r>
           </w:hyperlink>
         </w:p>
@@ -2152,7 +2152,7 @@
             </w:tabs>
             <w:rPr/>
           </w:pPr>
-          <w:hyperlink w:anchor="__RefHeading___Toc2843_2791007604" w:tooltip="4.3.4. Phiếu tính tiền và hồ sơ khách">
+          <w:hyperlink w:anchor="__RefHeading___Toc2838_4087052617" w:tooltip="4.3.4. Phiếu tính tiền và hồ sơ khách">
             <w:r>
               <w:rPr>
                 <w:rStyle w:val="IndexLink"/>
@@ -2166,7 +2166,7 @@
                 <w:rStyle w:val="IndexLink"/>
               </w:rPr>
               <w:tab/>
-              <w:t>27</w:t>
+              <w:t>26</w:t>
             </w:r>
           </w:hyperlink>
         </w:p>
@@ -2179,7 +2179,7 @@
             </w:tabs>
             <w:rPr/>
           </w:pPr>
-          <w:hyperlink w:anchor="__RefHeading___Toc2845_2791007604" w:tooltip="4.4. Phân hệ Thợ – lịch cá nhân và bảo mật thông tin khách">
+          <w:hyperlink w:anchor="__RefHeading___Toc2840_4087052617" w:tooltip="4.4. Phân hệ Thợ – lịch cá nhân và bảo mật thông tin khách">
             <w:r>
               <w:rPr>
                 <w:rStyle w:val="IndexLink"/>
@@ -2187,7 +2187,7 @@
               </w:rPr>
               <w:t>4.4. Phân hệ Thợ – lịch cá nhân và bảo mật thông tin khách</w:t>
               <w:tab/>
-              <w:t>28</w:t>
+              <w:t>27</w:t>
             </w:r>
           </w:hyperlink>
         </w:p>
@@ -2200,7 +2200,7 @@
             </w:tabs>
             <w:rPr/>
           </w:pPr>
-          <w:hyperlink w:anchor="__RefHeading___Toc2847_2791007604" w:tooltip="4.5. Phân hệ Chủ tiệm – báo cáo và cấu hình">
+          <w:hyperlink w:anchor="__RefHeading___Toc2842_4087052617" w:tooltip="4.5. Phân hệ Chủ tiệm – báo cáo và cấu hình">
             <w:r>
               <w:rPr>
                 <w:rStyle w:val="IndexLink"/>
@@ -2208,7 +2208,7 @@
               </w:rPr>
               <w:t>4.5. Phân hệ Chủ tiệm – báo cáo và cấu hình</w:t>
               <w:tab/>
-              <w:t>29</w:t>
+              <w:t>28</w:t>
             </w:r>
           </w:hyperlink>
         </w:p>
@@ -2221,7 +2221,7 @@
             </w:tabs>
             <w:rPr/>
           </w:pPr>
-          <w:hyperlink w:anchor="__RefHeading___Toc2849_2791007604" w:tooltip="4.6. Phân hệ Quản trị hệ thống">
+          <w:hyperlink w:anchor="__RefHeading___Toc2844_4087052617" w:tooltip="4.6. Phân hệ Quản trị hệ thống">
             <w:r>
               <w:rPr>
                 <w:rStyle w:val="IndexLink"/>
@@ -2229,7 +2229,7 @@
               </w:rPr>
               <w:t>4.6. Phân hệ Quản trị hệ thống</w:t>
               <w:tab/>
-              <w:t>30</w:t>
+              <w:t>29</w:t>
             </w:r>
           </w:hyperlink>
         </w:p>
@@ -2242,7 +2242,7 @@
             </w:tabs>
             <w:rPr/>
           </w:pPr>
-          <w:hyperlink w:anchor="__RefHeading___Toc2851_2791007604" w:tooltip="4.7. Hạ tầng tự động một chạm">
+          <w:hyperlink w:anchor="__RefHeading___Toc2846_4087052617" w:tooltip="4.7. Hạ tầng tự động một chạm">
             <w:r>
               <w:rPr>
                 <w:rStyle w:val="IndexLink"/>
@@ -2250,7 +2250,7 @@
               </w:rPr>
               <w:t>4.7. Hạ tầng tự động một chạm</w:t>
               <w:tab/>
-              <w:t>32</w:t>
+              <w:t>31</w:t>
             </w:r>
           </w:hyperlink>
         </w:p>
@@ -2263,7 +2263,7 @@
             </w:tabs>
             <w:rPr/>
           </w:pPr>
-          <w:hyperlink w:anchor="__RefHeading___Toc2853_2791007604" w:tooltip="4.7.1. Docker Compose và dữ liệu mẫu an toàn">
+          <w:hyperlink w:anchor="__RefHeading___Toc2848_4087052617" w:tooltip="4.7.1. Docker Compose và dữ liệu mẫu an toàn">
             <w:r>
               <w:rPr>
                 <w:rStyle w:val="IndexLink"/>
@@ -2277,7 +2277,7 @@
                 <w:rStyle w:val="IndexLink"/>
               </w:rPr>
               <w:tab/>
-              <w:t>32</w:t>
+              <w:t>31</w:t>
             </w:r>
           </w:hyperlink>
         </w:p>
@@ -2290,7 +2290,7 @@
             </w:tabs>
             <w:rPr/>
           </w:pPr>
-          <w:hyperlink w:anchor="__RefHeading___Toc2855_2791007604" w:tooltip="4.7.2. Real-time SSE và cập nhật một chạm">
+          <w:hyperlink w:anchor="__RefHeading___Toc2850_4087052617" w:tooltip="4.7.2. Real-time SSE và cập nhật một chạm">
             <w:r>
               <w:rPr>
                 <w:rStyle w:val="IndexLink"/>
@@ -2304,7 +2304,7 @@
                 <w:rStyle w:val="IndexLink"/>
               </w:rPr>
               <w:tab/>
-              <w:t>32</w:t>
+              <w:t>31</w:t>
             </w:r>
           </w:hyperlink>
         </w:p>
@@ -2317,7 +2317,7 @@
             </w:tabs>
             <w:rPr/>
           </w:pPr>
-          <w:hyperlink w:anchor="__RefHeading___Toc2857_2791007604" w:tooltip="4.7.3. Bộ giám sát Supervisor tự phục hồi (v1.2.5)">
+          <w:hyperlink w:anchor="__RefHeading___Toc2852_4087052617" w:tooltip="4.7.3. Bộ giám sát Supervisor tự phục hồi (v1.2.5)">
             <w:r>
               <w:rPr>
                 <w:rStyle w:val="IndexLink"/>
@@ -2331,7 +2331,7 @@
                 <w:rStyle w:val="IndexLink"/>
               </w:rPr>
               <w:tab/>
-              <w:t>33</w:t>
+              <w:t>32</w:t>
             </w:r>
           </w:hyperlink>
         </w:p>
@@ -2344,7 +2344,7 @@
             </w:tabs>
             <w:rPr/>
           </w:pPr>
-          <w:hyperlink w:anchor="__RefHeading___Toc2859_2791007604" w:tooltip="4.7.4. Tài khoản mẫu">
+          <w:hyperlink w:anchor="__RefHeading___Toc2854_4087052617" w:tooltip="4.7.4. Tài khoản mẫu">
             <w:r>
               <w:rPr>
                 <w:rStyle w:val="IndexLink"/>
@@ -2358,7 +2358,7 @@
                 <w:rStyle w:val="IndexLink"/>
               </w:rPr>
               <w:tab/>
-              <w:t>34</w:t>
+              <w:t>33</w:t>
             </w:r>
           </w:hyperlink>
         </w:p>
@@ -2371,7 +2371,7 @@
             </w:tabs>
             <w:rPr/>
           </w:pPr>
-          <w:hyperlink w:anchor="__RefHeading___Toc2861_2791007604" w:tooltip="CHƯƠNG 5 KIỂM THỬ, ĐÁNH GIÁ VÀ KẾT LUẬN">
+          <w:hyperlink w:anchor="__RefHeading___Toc2856_4087052617" w:tooltip="CHƯƠNG 5 KIỂM THỬ, ĐÁNH GIÁ VÀ KẾT LUẬN">
             <w:r>
               <w:rPr>
                 <w:rStyle w:val="IndexLink"/>
@@ -2379,7 +2379,7 @@
               </w:rPr>
               <w:t>CHƯƠNG 5 KIỂM THỬ, ĐÁNH GIÁ VÀ KẾT LUẬN</w:t>
               <w:tab/>
-              <w:t>35</w:t>
+              <w:t>34</w:t>
             </w:r>
           </w:hyperlink>
         </w:p>
@@ -2392,7 +2392,7 @@
             </w:tabs>
             <w:rPr/>
           </w:pPr>
-          <w:hyperlink w:anchor="__RefHeading___Toc2863_2791007604" w:tooltip="5.1. Chiến lược kiểm thử">
+          <w:hyperlink w:anchor="__RefHeading___Toc2858_4087052617" w:tooltip="5.1. Chiến lược kiểm thử">
             <w:r>
               <w:rPr>
                 <w:rStyle w:val="IndexLink"/>
@@ -2400,7 +2400,7 @@
               </w:rPr>
               <w:t>5.1. Chiến lược kiểm thử</w:t>
               <w:tab/>
-              <w:t>35</w:t>
+              <w:t>34</w:t>
             </w:r>
           </w:hyperlink>
         </w:p>
@@ -2413,7 +2413,7 @@
             </w:tabs>
             <w:rPr/>
           </w:pPr>
-          <w:hyperlink w:anchor="__RefHeading___Toc2865_2791007604" w:tooltip="5.2. Kết quả kiểm thử">
+          <w:hyperlink w:anchor="__RefHeading___Toc2860_4087052617" w:tooltip="5.2. Kết quả kiểm thử">
             <w:r>
               <w:rPr>
                 <w:rStyle w:val="IndexLink"/>
@@ -2421,7 +2421,7 @@
               </w:rPr>
               <w:t>5.2. Kết quả kiểm thử</w:t>
               <w:tab/>
-              <w:t>35</w:t>
+              <w:t>34</w:t>
             </w:r>
           </w:hyperlink>
         </w:p>
@@ -2434,15 +2434,15 @@
             </w:tabs>
             <w:rPr/>
           </w:pPr>
-          <w:hyperlink w:anchor="__RefHeading___Toc2867_2791007604" w:tooltip="5.3. Kết quả nghiệm thu">
+          <w:hyperlink w:anchor="__RefHeading___Toc2862_4087052617" w:tooltip="5.3. Kết quả đối chiếu User Story">
             <w:r>
               <w:rPr>
                 <w:rStyle w:val="IndexLink"/>
                 <w:webHidden/>
               </w:rPr>
-              <w:t>5.3. Kết quả nghiệm thu</w:t>
+              <w:t>5.3. Kết quả đối chiếu User Story</w:t>
               <w:tab/>
-              <w:t>36</w:t>
+              <w:t>35</w:t>
             </w:r>
           </w:hyperlink>
         </w:p>
@@ -2455,7 +2455,7 @@
             </w:tabs>
             <w:rPr/>
           </w:pPr>
-          <w:hyperlink w:anchor="__RefHeading___Toc2869_2791007604" w:tooltip="5.4. Đánh giá">
+          <w:hyperlink w:anchor="__RefHeading___Toc2864_4087052617" w:tooltip="5.4. Đánh giá">
             <w:r>
               <w:rPr>
                 <w:rStyle w:val="IndexLink"/>
@@ -2463,7 +2463,7 @@
               </w:rPr>
               <w:t>5.4. Đánh giá</w:t>
               <w:tab/>
-              <w:t>37</w:t>
+              <w:t>36</w:t>
             </w:r>
           </w:hyperlink>
         </w:p>
@@ -2476,7 +2476,7 @@
             </w:tabs>
             <w:rPr/>
           </w:pPr>
-          <w:hyperlink w:anchor="__RefHeading___Toc2871_2791007604" w:tooltip="5.4.1. Ưu điểm">
+          <w:hyperlink w:anchor="__RefHeading___Toc2866_4087052617" w:tooltip="5.4.1. Ưu điểm">
             <w:r>
               <w:rPr>
                 <w:rStyle w:val="IndexLink"/>
@@ -2490,7 +2490,7 @@
                 <w:rStyle w:val="IndexLink"/>
               </w:rPr>
               <w:tab/>
-              <w:t>37</w:t>
+              <w:t>36</w:t>
             </w:r>
           </w:hyperlink>
         </w:p>
@@ -2503,7 +2503,7 @@
             </w:tabs>
             <w:rPr/>
           </w:pPr>
-          <w:hyperlink w:anchor="__RefHeading___Toc2873_2791007604" w:tooltip="5.4.2. Hạn chế">
+          <w:hyperlink w:anchor="__RefHeading___Toc2868_4087052617" w:tooltip="5.4.2. Hạn chế">
             <w:r>
               <w:rPr>
                 <w:rStyle w:val="IndexLink"/>
@@ -2517,7 +2517,7 @@
                 <w:rStyle w:val="IndexLink"/>
               </w:rPr>
               <w:tab/>
-              <w:t>37</w:t>
+              <w:t>36</w:t>
             </w:r>
           </w:hyperlink>
         </w:p>
@@ -2530,7 +2530,7 @@
             </w:tabs>
             <w:rPr/>
           </w:pPr>
-          <w:hyperlink w:anchor="__RefHeading___Toc2875_2791007604" w:tooltip="5.5. Hướng phát triển">
+          <w:hyperlink w:anchor="__RefHeading___Toc2870_4087052617" w:tooltip="5.5. Hướng phát triển">
             <w:r>
               <w:rPr>
                 <w:rStyle w:val="IndexLink"/>
@@ -2538,7 +2538,7 @@
               </w:rPr>
               <w:t>5.5. Hướng phát triển</w:t>
               <w:tab/>
-              <w:t>38</w:t>
+              <w:t>37</w:t>
             </w:r>
           </w:hyperlink>
         </w:p>
@@ -2551,7 +2551,7 @@
             </w:tabs>
             <w:rPr/>
           </w:pPr>
-          <w:hyperlink w:anchor="__RefHeading___Toc2877_2791007604" w:tooltip="5.6. Kết luận">
+          <w:hyperlink w:anchor="__RefHeading___Toc2872_4087052617" w:tooltip="5.6. Kết luận">
             <w:r>
               <w:rPr>
                 <w:rStyle w:val="IndexLink"/>
@@ -2559,7 +2559,7 @@
               </w:rPr>
               <w:t>5.6. Kết luận</w:t>
               <w:tab/>
-              <w:t>38</w:t>
+              <w:t>37</w:t>
             </w:r>
           </w:hyperlink>
         </w:p>
@@ -2572,7 +2572,7 @@
             </w:tabs>
             <w:rPr/>
           </w:pPr>
-          <w:hyperlink w:anchor="__RefHeading___Toc2879_2791007604" w:tooltip="TÀI LIỆU THAM KHẢO">
+          <w:hyperlink w:anchor="__RefHeading___Toc2874_4087052617" w:tooltip="TÀI LIỆU THAM KHẢO">
             <w:r>
               <w:rPr>
                 <w:rStyle w:val="IndexLink"/>
@@ -2580,7 +2580,7 @@
               </w:rPr>
               <w:t>TÀI LIỆU THAM KHẢO</w:t>
               <w:tab/>
-              <w:t>39</w:t>
+              <w:t>38</w:t>
             </w:r>
           </w:hyperlink>
           <w:r>
@@ -2597,7 +2597,7 @@
         <w:pStyle w:val="Heading1"/>
         <w:rPr/>
       </w:pPr>
-      <w:bookmarkStart w:id="2" w:name="__RefHeading___Toc2781_2791007604"/>
+      <w:bookmarkStart w:id="2" w:name="__RefHeading___Toc2776_4087052617"/>
       <w:bookmarkEnd w:id="2"/>
       <w:r>
         <w:rPr>
@@ -3599,7 +3599,7 @@
         <w:pStyle w:val="Heading1"/>
         <w:rPr/>
       </w:pPr>
-      <w:bookmarkStart w:id="3" w:name="__RefHeading___Toc2783_2791007604"/>
+      <w:bookmarkStart w:id="3" w:name="__RefHeading___Toc2778_4087052617"/>
       <w:bookmarkEnd w:id="3"/>
       <w:r>
         <w:rPr>
@@ -3617,7 +3617,7 @@
         <w:pStyle w:val="Heading2"/>
         <w:rPr/>
       </w:pPr>
-      <w:bookmarkStart w:id="4" w:name="__RefHeading___Toc2785_2791007604"/>
+      <w:bookmarkStart w:id="4" w:name="__RefHeading___Toc2780_4087052617"/>
       <w:bookmarkEnd w:id="4"/>
       <w:r>
         <w:rPr>
@@ -3685,7 +3685,7 @@
         <w:pStyle w:val="Heading2"/>
         <w:rPr/>
       </w:pPr>
-      <w:bookmarkStart w:id="5" w:name="__RefHeading___Toc2787_2791007604"/>
+      <w:bookmarkStart w:id="5" w:name="__RefHeading___Toc2782_4087052617"/>
       <w:bookmarkEnd w:id="5"/>
       <w:r>
         <w:rPr>
@@ -3854,7 +3854,7 @@
         <w:pStyle w:val="Heading2"/>
         <w:rPr/>
       </w:pPr>
-      <w:bookmarkStart w:id="6" w:name="__RefHeading___Toc2789_2791007604"/>
+      <w:bookmarkStart w:id="6" w:name="__RefHeading___Toc2784_4087052617"/>
       <w:bookmarkEnd w:id="6"/>
       <w:r>
         <w:rPr>
@@ -4587,7 +4587,7 @@
         <w:pStyle w:val="Heading2"/>
         <w:rPr/>
       </w:pPr>
-      <w:bookmarkStart w:id="7" w:name="__RefHeading___Toc2791_2791007604"/>
+      <w:bookmarkStart w:id="7" w:name="__RefHeading___Toc2786_4087052617"/>
       <w:bookmarkEnd w:id="7"/>
       <w:r>
         <w:rPr>
@@ -4860,7 +4860,7 @@
         <w:pStyle w:val="Heading2"/>
         <w:rPr/>
       </w:pPr>
-      <w:bookmarkStart w:id="8" w:name="__RefHeading___Toc2793_2791007604"/>
+      <w:bookmarkStart w:id="8" w:name="__RefHeading___Toc2788_4087052617"/>
       <w:bookmarkEnd w:id="8"/>
       <w:r>
         <w:rPr>
@@ -5516,7 +5516,7 @@
         <w:pStyle w:val="Heading2"/>
         <w:rPr/>
       </w:pPr>
-      <w:bookmarkStart w:id="9" w:name="__RefHeading___Toc2795_2791007604"/>
+      <w:bookmarkStart w:id="9" w:name="__RefHeading___Toc2790_4087052617"/>
       <w:bookmarkEnd w:id="9"/>
       <w:r>
         <w:rPr>
@@ -6508,7 +6508,7 @@
         <w:pStyle w:val="Heading1"/>
         <w:rPr/>
       </w:pPr>
-      <w:bookmarkStart w:id="10" w:name="__RefHeading___Toc2797_2791007604"/>
+      <w:bookmarkStart w:id="10" w:name="__RefHeading___Toc2792_4087052617"/>
       <w:bookmarkEnd w:id="10"/>
       <w:r>
         <w:rPr>
@@ -6526,7 +6526,7 @@
         <w:pStyle w:val="Heading2"/>
         <w:rPr/>
       </w:pPr>
-      <w:bookmarkStart w:id="11" w:name="__RefHeading___Toc2799_2791007604"/>
+      <w:bookmarkStart w:id="11" w:name="__RefHeading___Toc2794_4087052617"/>
       <w:bookmarkEnd w:id="11"/>
       <w:r>
         <w:rPr>
@@ -7046,7 +7046,7 @@
         <w:pStyle w:val="Heading2"/>
         <w:rPr/>
       </w:pPr>
-      <w:bookmarkStart w:id="12" w:name="__RefHeading___Toc2801_2791007604"/>
+      <w:bookmarkStart w:id="12" w:name="__RefHeading___Toc2796_4087052617"/>
       <w:bookmarkEnd w:id="12"/>
       <w:r>
         <w:rPr>
@@ -8367,7 +8367,7 @@
         <w:pStyle w:val="Heading3"/>
         <w:rPr/>
       </w:pPr>
-      <w:bookmarkStart w:id="13" w:name="__RefHeading___Toc2803_2791007604"/>
+      <w:bookmarkStart w:id="13" w:name="__RefHeading___Toc2798_4087052617"/>
       <w:bookmarkEnd w:id="13"/>
       <w:r>
         <w:rPr>
@@ -13298,7 +13298,7 @@
         <w:pStyle w:val="Heading2"/>
         <w:rPr/>
       </w:pPr>
-      <w:bookmarkStart w:id="14" w:name="__RefHeading___Toc2805_2791007604"/>
+      <w:bookmarkStart w:id="14" w:name="__RefHeading___Toc2800_4087052617"/>
       <w:bookmarkEnd w:id="14"/>
       <w:r>
         <w:rPr>
@@ -14302,7 +14302,7 @@
         <w:pStyle w:val="Heading2"/>
         <w:rPr/>
       </w:pPr>
-      <w:bookmarkStart w:id="15" w:name="__RefHeading___Toc2807_2791007604"/>
+      <w:bookmarkStart w:id="15" w:name="__RefHeading___Toc2802_4087052617"/>
       <w:bookmarkEnd w:id="15"/>
       <w:r>
         <w:rPr>
@@ -18164,7 +18164,7 @@
         <w:pStyle w:val="Heading1"/>
         <w:rPr/>
       </w:pPr>
-      <w:bookmarkStart w:id="16" w:name="__RefHeading___Toc2809_2791007604"/>
+      <w:bookmarkStart w:id="16" w:name="__RefHeading___Toc2804_4087052617"/>
       <w:bookmarkEnd w:id="16"/>
       <w:r>
         <w:rPr>
@@ -18182,7 +18182,7 @@
         <w:pStyle w:val="Heading2"/>
         <w:rPr/>
       </w:pPr>
-      <w:bookmarkStart w:id="17" w:name="__RefHeading___Toc2811_2791007604"/>
+      <w:bookmarkStart w:id="17" w:name="__RefHeading___Toc2806_4087052617"/>
       <w:bookmarkEnd w:id="17"/>
       <w:r>
         <w:rPr>
@@ -18756,81 +18756,6 @@
         <w:t>: một kho mã chứa cả backend, frontend, lược đồ CSDL, tài liệu và các script khởi động. Hai ứng dụng giao tiếp qua REST/JSON; ở môi trường phát triển, Vite làm proxy chuyển /api, /uploads, /health sang NestJS nên trình duyệt chỉ làm việc với một địa chỉ duy nhất.</w:t>
       </w:r>
     </w:p>
-    <w:p>
-      <w:pPr>
-        <w:pStyle w:val="Normal"/>
-        <w:keepNext w:val="true"/>
-        <w:spacing w:lineRule="auto" w:line="240" w:before="120" w:after="0"/>
-        <w:jc w:val="center"/>
-        <w:rPr/>
-      </w:pPr>
-      <w:r>
-        <w:rPr/>
-        <w:drawing>
-          <wp:inline distT="0" distB="0" distL="0" distR="0">
-            <wp:extent cx="5939790" cy="4156075"/>
-            <wp:effectExtent l="0" t="0" r="0" b="0"/>
-            <wp:docPr id="1" name="Picture 1"/>
-            <wp:cNvGraphicFramePr>
-              <a:graphicFrameLocks xmlns:a="http://schemas.openxmlformats.org/drawingml/2006/main" noChangeAspect="1"/>
-            </wp:cNvGraphicFramePr>
-            <a:graphic xmlns:a="http://schemas.openxmlformats.org/drawingml/2006/main">
-              <a:graphicData uri="http://schemas.openxmlformats.org/drawingml/2006/picture">
-                <pic:pic xmlns:pic="http://schemas.openxmlformats.org/drawingml/2006/picture">
-                  <pic:nvPicPr>
-                    <pic:cNvPr id="1" name="Picture 1"/>
-                    <pic:cNvPicPr>
-                      <a:picLocks noChangeAspect="1" noChangeArrowheads="1"/>
-                    </pic:cNvPicPr>
-                  </pic:nvPicPr>
-                  <pic:blipFill>
-                    <a:blip r:embed="rId5"/>
-                    <a:stretch>
-                      <a:fillRect/>
-                    </a:stretch>
-                  </pic:blipFill>
-                  <pic:spPr bwMode="auto">
-                    <a:xfrm>
-                      <a:off x="0" y="0"/>
-                      <a:ext cx="5939790" cy="4156075"/>
-                    </a:xfrm>
-                    <a:prstGeom prst="rect">
-                      <a:avLst/>
-                    </a:prstGeom>
-                    <a:noFill/>
-                  </pic:spPr>
-                </pic:pic>
-              </a:graphicData>
-            </a:graphic>
-          </wp:inline>
-        </w:drawing>
-      </w:r>
-    </w:p>
-    <w:p>
-      <w:pPr>
-        <w:pStyle w:val="Normal"/>
-        <w:spacing w:before="0" w:after="120"/>
-        <w:jc w:val="center"/>
-        <w:rPr/>
-      </w:pPr>
-      <w:r>
-        <w:rPr>
-          <w:rFonts w:eastAsia="Times New Roman" w:cs="Times New Roman"/>
-          <w:b/>
-          <w:i/>
-          <w:sz w:val="26"/>
-        </w:rPr>
-        <w:t xml:space="preserve">Hình 3.1: </w:t>
-      </w:r>
-      <w:r>
-        <w:rPr>
-          <w:rFonts w:eastAsia="Times New Roman" w:cs="Times New Roman"/>
-          <w:i/>
-          <w:sz w:val="26"/>
-        </w:rPr>
-        <w:t>Kiến trúc tổng thể của hệ thống</w:t>
-      </w:r>
-    </w:p>
     <w:tbl>
       <w:tblPr>
         <w:tblW w:w="9355" w:type="dxa"/>
@@ -19042,7 +18967,7 @@
         <w:pStyle w:val="Heading3"/>
         <w:rPr/>
       </w:pPr>
-      <w:bookmarkStart w:id="18" w:name="__RefHeading___Toc2813_2791007604"/>
+      <w:bookmarkStart w:id="18" w:name="__RefHeading___Toc2808_4087052617"/>
       <w:bookmarkEnd w:id="18"/>
       <w:r>
         <w:rPr>
@@ -19268,7 +19193,7 @@
         <w:pStyle w:val="Heading3"/>
         <w:rPr/>
       </w:pPr>
-      <w:bookmarkStart w:id="19" w:name="__RefHeading___Toc2815_2791007604"/>
+      <w:bookmarkStart w:id="19" w:name="__RefHeading___Toc2810_4087052617"/>
       <w:bookmarkEnd w:id="19"/>
       <w:r>
         <w:rPr>
@@ -19400,7 +19325,7 @@
         <w:pStyle w:val="Heading3"/>
         <w:rPr/>
       </w:pPr>
-      <w:bookmarkStart w:id="20" w:name="__RefHeading___Toc2817_2791007604"/>
+      <w:bookmarkStart w:id="20" w:name="__RefHeading___Toc2812_4087052617"/>
       <w:bookmarkEnd w:id="20"/>
       <w:r>
         <w:rPr>
@@ -19913,7 +19838,7 @@
         <w:pStyle w:val="Heading2"/>
         <w:rPr/>
       </w:pPr>
-      <w:bookmarkStart w:id="21" w:name="__RefHeading___Toc2819_2791007604"/>
+      <w:bookmarkStart w:id="21" w:name="__RefHeading___Toc2814_4087052617"/>
       <w:bookmarkEnd w:id="21"/>
       <w:r>
         <w:rPr>
@@ -19991,7 +19916,7 @@
           <wp:inline distT="0" distB="0" distL="0" distR="0">
             <wp:extent cx="5939790" cy="5015230"/>
             <wp:effectExtent l="0" t="0" r="0" b="0"/>
-            <wp:docPr id="2" name="Picture 2"/>
+            <wp:docPr id="1" name="Picture 1"/>
             <wp:cNvGraphicFramePr>
               <a:graphicFrameLocks xmlns:a="http://schemas.openxmlformats.org/drawingml/2006/main" noChangeAspect="1"/>
             </wp:cNvGraphicFramePr>
@@ -19999,13 +19924,13 @@
               <a:graphicData uri="http://schemas.openxmlformats.org/drawingml/2006/picture">
                 <pic:pic xmlns:pic="http://schemas.openxmlformats.org/drawingml/2006/picture">
                   <pic:nvPicPr>
-                    <pic:cNvPr id="2" name="Picture 2"/>
+                    <pic:cNvPr id="1" name="Picture 1"/>
                     <pic:cNvPicPr>
                       <a:picLocks noChangeAspect="1" noChangeArrowheads="1"/>
                     </pic:cNvPicPr>
                   </pic:nvPicPr>
                   <pic:blipFill>
-                    <a:blip r:embed="rId6"/>
+                    <a:blip r:embed="rId5"/>
                     <a:stretch>
                       <a:fillRect/>
                     </a:stretch>
@@ -20041,7 +19966,7 @@
           <w:i/>
           <w:sz w:val="26"/>
         </w:rPr>
-        <w:t xml:space="preserve">Hình 3.2: </w:t>
+        <w:t xml:space="preserve">Hình 3.1: </w:t>
       </w:r>
       <w:r>
         <w:rPr>
@@ -20757,7 +20682,7 @@
         <w:pStyle w:val="Heading3"/>
         <w:rPr/>
       </w:pPr>
-      <w:bookmarkStart w:id="22" w:name="__RefHeading___Toc2821_2791007604"/>
+      <w:bookmarkStart w:id="22" w:name="__RefHeading___Toc2816_4087052617"/>
       <w:bookmarkEnd w:id="22"/>
       <w:r>
         <w:rPr>
@@ -21791,7 +21716,7 @@
         <w:pStyle w:val="Heading3"/>
         <w:rPr/>
       </w:pPr>
-      <w:bookmarkStart w:id="23" w:name="__RefHeading___Toc2823_2791007604"/>
+      <w:bookmarkStart w:id="23" w:name="__RefHeading___Toc2818_4087052617"/>
       <w:bookmarkEnd w:id="23"/>
       <w:r>
         <w:rPr>
@@ -22022,7 +21947,7 @@
         <w:pStyle w:val="Heading2"/>
         <w:rPr/>
       </w:pPr>
-      <w:bookmarkStart w:id="24" w:name="__RefHeading___Toc2825_2791007604"/>
+      <w:bookmarkStart w:id="24" w:name="__RefHeading___Toc2820_4087052617"/>
       <w:bookmarkEnd w:id="24"/>
       <w:r>
         <w:rPr>
@@ -22272,7 +22197,7 @@
         <w:pStyle w:val="Heading2"/>
         <w:rPr/>
       </w:pPr>
-      <w:bookmarkStart w:id="25" w:name="__RefHeading___Toc2827_2791007604"/>
+      <w:bookmarkStart w:id="25" w:name="__RefHeading___Toc2822_4087052617"/>
       <w:bookmarkEnd w:id="25"/>
       <w:r>
         <w:rPr>
@@ -22420,7 +22345,7 @@
           <wp:inline distT="0" distB="0" distL="0" distR="0">
             <wp:extent cx="5939790" cy="2522855"/>
             <wp:effectExtent l="0" t="0" r="0" b="0"/>
-            <wp:docPr id="3" name="Picture 3"/>
+            <wp:docPr id="2" name="Picture 2"/>
             <wp:cNvGraphicFramePr>
               <a:graphicFrameLocks xmlns:a="http://schemas.openxmlformats.org/drawingml/2006/main" noChangeAspect="1"/>
             </wp:cNvGraphicFramePr>
@@ -22428,13 +22353,13 @@
               <a:graphicData uri="http://schemas.openxmlformats.org/drawingml/2006/picture">
                 <pic:pic xmlns:pic="http://schemas.openxmlformats.org/drawingml/2006/picture">
                   <pic:nvPicPr>
-                    <pic:cNvPr id="3" name="Picture 3"/>
+                    <pic:cNvPr id="2" name="Picture 2"/>
                     <pic:cNvPicPr>
                       <a:picLocks noChangeAspect="1" noChangeArrowheads="1"/>
                     </pic:cNvPicPr>
                   </pic:nvPicPr>
                   <pic:blipFill>
-                    <a:blip r:embed="rId7"/>
+                    <a:blip r:embed="rId6"/>
                     <a:stretch>
                       <a:fillRect/>
                     </a:stretch>
@@ -22470,7 +22395,7 @@
           <w:i/>
           <w:sz w:val="26"/>
         </w:rPr>
-        <w:t xml:space="preserve">Hình 3.3: </w:t>
+        <w:t xml:space="preserve">Hình 3.2: </w:t>
       </w:r>
       <w:r>
         <w:rPr>
@@ -22738,7 +22663,7 @@
         <w:pStyle w:val="Heading1"/>
         <w:rPr/>
       </w:pPr>
-      <w:bookmarkStart w:id="26" w:name="__RefHeading___Toc2829_2791007604"/>
+      <w:bookmarkStart w:id="26" w:name="__RefHeading___Toc2824_4087052617"/>
       <w:bookmarkEnd w:id="26"/>
       <w:r>
         <w:rPr>
@@ -22756,7 +22681,7 @@
         <w:pStyle w:val="Heading2"/>
         <w:rPr/>
       </w:pPr>
-      <w:bookmarkStart w:id="27" w:name="__RefHeading___Toc2831_2791007604"/>
+      <w:bookmarkStart w:id="27" w:name="__RefHeading___Toc2826_4087052617"/>
       <w:bookmarkEnd w:id="27"/>
       <w:r>
         <w:rPr>
@@ -23277,7 +23202,7 @@
           <w:i w:val="false"/>
           <w:sz w:val="26"/>
         </w:rPr>
-        <w:t>Tài liệu API sinh tự động bằng Swagger tại địa chỉ /api/docs của backend; danh mục 59 endpoint kèm vai trò được phép nằm trong docs/API.md.</w:t>
+        <w:t>Tài liệu API sinh tự động bằng Swagger tại địa chỉ /api/docs của backend; danh mục endpoint kèm vai trò được phép nằm trong docs/API.md.</w:t>
       </w:r>
     </w:p>
     <w:p>
@@ -23285,7 +23210,7 @@
         <w:pStyle w:val="Heading2"/>
         <w:rPr/>
       </w:pPr>
-      <w:bookmarkStart w:id="28" w:name="__RefHeading___Toc2833_2791007604"/>
+      <w:bookmarkStart w:id="28" w:name="__RefHeading___Toc2828_4087052617"/>
       <w:bookmarkEnd w:id="28"/>
       <w:r>
         <w:rPr>
@@ -23345,7 +23270,7 @@
           <wp:inline distT="0" distB="0" distL="0" distR="0">
             <wp:extent cx="5939790" cy="3712845"/>
             <wp:effectExtent l="0" t="0" r="0" b="0"/>
-            <wp:docPr id="4" name="Picture 4"/>
+            <wp:docPr id="3" name="Picture 3"/>
             <wp:cNvGraphicFramePr>
               <a:graphicFrameLocks xmlns:a="http://schemas.openxmlformats.org/drawingml/2006/main" noChangeAspect="1"/>
             </wp:cNvGraphicFramePr>
@@ -23353,13 +23278,13 @@
               <a:graphicData uri="http://schemas.openxmlformats.org/drawingml/2006/picture">
                 <pic:pic xmlns:pic="http://schemas.openxmlformats.org/drawingml/2006/picture">
                   <pic:nvPicPr>
-                    <pic:cNvPr id="4" name="Picture 4"/>
+                    <pic:cNvPr id="3" name="Picture 3"/>
                     <pic:cNvPicPr>
                       <a:picLocks noChangeAspect="1" noChangeArrowheads="1"/>
                     </pic:cNvPicPr>
                   </pic:nvPicPr>
                   <pic:blipFill>
-                    <a:blip r:embed="rId8"/>
+                    <a:blip r:embed="rId7"/>
                     <a:stretch>
                       <a:fillRect/>
                     </a:stretch>
@@ -23473,7 +23398,7 @@
           <wp:inline distT="0" distB="0" distL="0" distR="0">
             <wp:extent cx="5939790" cy="3712845"/>
             <wp:effectExtent l="0" t="0" r="0" b="0"/>
-            <wp:docPr id="5" name="Picture 5"/>
+            <wp:docPr id="4" name="Picture 4"/>
             <wp:cNvGraphicFramePr>
               <a:graphicFrameLocks xmlns:a="http://schemas.openxmlformats.org/drawingml/2006/main" noChangeAspect="1"/>
             </wp:cNvGraphicFramePr>
@@ -23481,13 +23406,13 @@
               <a:graphicData uri="http://schemas.openxmlformats.org/drawingml/2006/picture">
                 <pic:pic xmlns:pic="http://schemas.openxmlformats.org/drawingml/2006/picture">
                   <pic:nvPicPr>
-                    <pic:cNvPr id="5" name="Picture 5"/>
+                    <pic:cNvPr id="4" name="Picture 4"/>
                     <pic:cNvPicPr>
                       <a:picLocks noChangeAspect="1" noChangeArrowheads="1"/>
                     </pic:cNvPicPr>
                   </pic:nvPicPr>
                   <pic:blipFill>
-                    <a:blip r:embed="rId9"/>
+                    <a:blip r:embed="rId8"/>
                     <a:stretch>
                       <a:fillRect/>
                     </a:stretch>
@@ -23574,7 +23499,7 @@
                 <wp:inline distT="0" distB="0" distL="0" distR="0">
                   <wp:extent cx="1800225" cy="3895725"/>
                   <wp:effectExtent l="0" t="0" r="0" b="0"/>
-                  <wp:docPr id="6" name="Picture 6"/>
+                  <wp:docPr id="5" name="Picture 5"/>
                   <wp:cNvGraphicFramePr>
                     <a:graphicFrameLocks xmlns:a="http://schemas.openxmlformats.org/drawingml/2006/main" noChangeAspect="1"/>
                   </wp:cNvGraphicFramePr>
@@ -23582,13 +23507,13 @@
                     <a:graphicData uri="http://schemas.openxmlformats.org/drawingml/2006/picture">
                       <pic:pic xmlns:pic="http://schemas.openxmlformats.org/drawingml/2006/picture">
                         <pic:nvPicPr>
-                          <pic:cNvPr id="6" name="Picture 6"/>
+                          <pic:cNvPr id="5" name="Picture 5"/>
                           <pic:cNvPicPr>
                             <a:picLocks noChangeAspect="1" noChangeArrowheads="1"/>
                           </pic:cNvPicPr>
                         </pic:nvPicPr>
                         <pic:blipFill>
-                          <a:blip r:embed="rId10"/>
+                          <a:blip r:embed="rId9"/>
                           <a:stretch>
                             <a:fillRect/>
                           </a:stretch>
@@ -23631,7 +23556,7 @@
                 <wp:inline distT="0" distB="0" distL="0" distR="0">
                   <wp:extent cx="3672205" cy="2294890"/>
                   <wp:effectExtent l="0" t="0" r="0" b="0"/>
-                  <wp:docPr id="7" name="Picture 7"/>
+                  <wp:docPr id="6" name="Picture 6"/>
                   <wp:cNvGraphicFramePr>
                     <a:graphicFrameLocks xmlns:a="http://schemas.openxmlformats.org/drawingml/2006/main" noChangeAspect="1"/>
                   </wp:cNvGraphicFramePr>
@@ -23639,13 +23564,13 @@
                     <a:graphicData uri="http://schemas.openxmlformats.org/drawingml/2006/picture">
                       <pic:pic xmlns:pic="http://schemas.openxmlformats.org/drawingml/2006/picture">
                         <pic:nvPicPr>
-                          <pic:cNvPr id="7" name="Picture 7"/>
+                          <pic:cNvPr id="6" name="Picture 6"/>
                           <pic:cNvPicPr>
                             <a:picLocks noChangeAspect="1" noChangeArrowheads="1"/>
                           </pic:cNvPicPr>
                         </pic:nvPicPr>
                         <pic:blipFill>
-                          <a:blip r:embed="rId11"/>
+                          <a:blip r:embed="rId10"/>
                           <a:stretch>
                             <a:fillRect/>
                           </a:stretch>
@@ -23753,7 +23678,7 @@
         <w:pStyle w:val="Heading2"/>
         <w:rPr/>
       </w:pPr>
-      <w:bookmarkStart w:id="29" w:name="__RefHeading___Toc2835_2791007604"/>
+      <w:bookmarkStart w:id="29" w:name="__RefHeading___Toc2830_4087052617"/>
       <w:bookmarkEnd w:id="29"/>
       <w:r>
         <w:rPr>
@@ -23769,7 +23694,7 @@
         <w:pStyle w:val="Heading3"/>
         <w:rPr/>
       </w:pPr>
-      <w:bookmarkStart w:id="30" w:name="__RefHeading___Toc2837_2791007604"/>
+      <w:bookmarkStart w:id="30" w:name="__RefHeading___Toc2832_4087052617"/>
       <w:bookmarkEnd w:id="30"/>
       <w:r>
         <w:rPr>
@@ -23812,7 +23737,7 @@
           <wp:inline distT="0" distB="0" distL="0" distR="0">
             <wp:extent cx="5939790" cy="3712845"/>
             <wp:effectExtent l="0" t="0" r="0" b="0"/>
-            <wp:docPr id="8" name="Picture 8"/>
+            <wp:docPr id="7" name="Picture 7"/>
             <wp:cNvGraphicFramePr>
               <a:graphicFrameLocks xmlns:a="http://schemas.openxmlformats.org/drawingml/2006/main" noChangeAspect="1"/>
             </wp:cNvGraphicFramePr>
@@ -23820,13 +23745,13 @@
               <a:graphicData uri="http://schemas.openxmlformats.org/drawingml/2006/picture">
                 <pic:pic xmlns:pic="http://schemas.openxmlformats.org/drawingml/2006/picture">
                   <pic:nvPicPr>
-                    <pic:cNvPr id="8" name="Picture 8"/>
+                    <pic:cNvPr id="7" name="Picture 7"/>
                     <pic:cNvPicPr>
                       <a:picLocks noChangeAspect="1" noChangeArrowheads="1"/>
                     </pic:cNvPicPr>
                   </pic:nvPicPr>
                   <pic:blipFill>
-                    <a:blip r:embed="rId12"/>
+                    <a:blip r:embed="rId11"/>
                     <a:stretch>
                       <a:fillRect/>
                     </a:stretch>
@@ -23878,7 +23803,7 @@
         <w:pStyle w:val="Heading3"/>
         <w:rPr/>
       </w:pPr>
-      <w:bookmarkStart w:id="31" w:name="__RefHeading___Toc2839_2791007604"/>
+      <w:bookmarkStart w:id="31" w:name="__RefHeading___Toc2834_4087052617"/>
       <w:bookmarkEnd w:id="31"/>
       <w:r>
         <w:rPr>
@@ -24056,7 +23981,7 @@
           <wp:inline distT="0" distB="0" distL="0" distR="0">
             <wp:extent cx="5939790" cy="3712845"/>
             <wp:effectExtent l="0" t="0" r="0" b="0"/>
-            <wp:docPr id="9" name="Picture 9"/>
+            <wp:docPr id="8" name="Picture 8"/>
             <wp:cNvGraphicFramePr>
               <a:graphicFrameLocks xmlns:a="http://schemas.openxmlformats.org/drawingml/2006/main" noChangeAspect="1"/>
             </wp:cNvGraphicFramePr>
@@ -24064,13 +23989,13 @@
               <a:graphicData uri="http://schemas.openxmlformats.org/drawingml/2006/picture">
                 <pic:pic xmlns:pic="http://schemas.openxmlformats.org/drawingml/2006/picture">
                   <pic:nvPicPr>
-                    <pic:cNvPr id="9" name="Picture 9"/>
+                    <pic:cNvPr id="8" name="Picture 8"/>
                     <pic:cNvPicPr>
                       <a:picLocks noChangeAspect="1" noChangeArrowheads="1"/>
                     </pic:cNvPicPr>
                   </pic:nvPicPr>
                   <pic:blipFill>
-                    <a:blip r:embed="rId13"/>
+                    <a:blip r:embed="rId12"/>
                     <a:stretch>
                       <a:fillRect/>
                     </a:stretch>
@@ -24122,7 +24047,7 @@
         <w:pStyle w:val="Heading3"/>
         <w:rPr/>
       </w:pPr>
-      <w:bookmarkStart w:id="32" w:name="__RefHeading___Toc2841_2791007604"/>
+      <w:bookmarkStart w:id="32" w:name="__RefHeading___Toc2836_4087052617"/>
       <w:bookmarkEnd w:id="32"/>
       <w:r>
         <w:rPr>
@@ -24183,7 +24108,7 @@
           <wp:inline distT="0" distB="0" distL="0" distR="0">
             <wp:extent cx="5939790" cy="3712845"/>
             <wp:effectExtent l="0" t="0" r="0" b="0"/>
-            <wp:docPr id="10" name="Picture 10"/>
+            <wp:docPr id="9" name="Picture 9"/>
             <wp:cNvGraphicFramePr>
               <a:graphicFrameLocks xmlns:a="http://schemas.openxmlformats.org/drawingml/2006/main" noChangeAspect="1"/>
             </wp:cNvGraphicFramePr>
@@ -24191,13 +24116,13 @@
               <a:graphicData uri="http://schemas.openxmlformats.org/drawingml/2006/picture">
                 <pic:pic xmlns:pic="http://schemas.openxmlformats.org/drawingml/2006/picture">
                   <pic:nvPicPr>
-                    <pic:cNvPr id="10" name="Picture 10"/>
+                    <pic:cNvPr id="9" name="Picture 9"/>
                     <pic:cNvPicPr>
                       <a:picLocks noChangeAspect="1" noChangeArrowheads="1"/>
                     </pic:cNvPicPr>
                   </pic:nvPicPr>
                   <pic:blipFill>
-                    <a:blip r:embed="rId14"/>
+                    <a:blip r:embed="rId13"/>
                     <a:stretch>
                       <a:fillRect/>
                     </a:stretch>
@@ -24249,7 +24174,7 @@
         <w:pStyle w:val="Heading3"/>
         <w:rPr/>
       </w:pPr>
-      <w:bookmarkStart w:id="33" w:name="__RefHeading___Toc2843_2791007604"/>
+      <w:bookmarkStart w:id="33" w:name="__RefHeading___Toc2838_4087052617"/>
       <w:bookmarkEnd w:id="33"/>
       <w:r>
         <w:rPr>
@@ -24328,7 +24253,7 @@
           <wp:inline distT="0" distB="0" distL="0" distR="0">
             <wp:extent cx="5939790" cy="3712845"/>
             <wp:effectExtent l="0" t="0" r="0" b="0"/>
-            <wp:docPr id="11" name="Picture 11"/>
+            <wp:docPr id="10" name="Picture 10"/>
             <wp:cNvGraphicFramePr>
               <a:graphicFrameLocks xmlns:a="http://schemas.openxmlformats.org/drawingml/2006/main" noChangeAspect="1"/>
             </wp:cNvGraphicFramePr>
@@ -24336,13 +24261,13 @@
               <a:graphicData uri="http://schemas.openxmlformats.org/drawingml/2006/picture">
                 <pic:pic xmlns:pic="http://schemas.openxmlformats.org/drawingml/2006/picture">
                   <pic:nvPicPr>
-                    <pic:cNvPr id="11" name="Picture 11"/>
+                    <pic:cNvPr id="10" name="Picture 10"/>
                     <pic:cNvPicPr>
                       <a:picLocks noChangeAspect="1" noChangeArrowheads="1"/>
                     </pic:cNvPicPr>
                   </pic:nvPicPr>
                   <pic:blipFill>
-                    <a:blip r:embed="rId15"/>
+                    <a:blip r:embed="rId14"/>
                     <a:stretch>
                       <a:fillRect/>
                     </a:stretch>
@@ -24394,7 +24319,7 @@
         <w:pStyle w:val="Heading2"/>
         <w:rPr/>
       </w:pPr>
-      <w:bookmarkStart w:id="34" w:name="__RefHeading___Toc2845_2791007604"/>
+      <w:bookmarkStart w:id="34" w:name="__RefHeading___Toc2840_4087052617"/>
       <w:bookmarkEnd w:id="34"/>
       <w:r>
         <w:rPr>
@@ -24490,7 +24415,7 @@
           <wp:inline distT="0" distB="0" distL="0" distR="0">
             <wp:extent cx="5939790" cy="3712845"/>
             <wp:effectExtent l="0" t="0" r="0" b="0"/>
-            <wp:docPr id="12" name="Picture 12"/>
+            <wp:docPr id="11" name="Picture 11"/>
             <wp:cNvGraphicFramePr>
               <a:graphicFrameLocks xmlns:a="http://schemas.openxmlformats.org/drawingml/2006/main" noChangeAspect="1"/>
             </wp:cNvGraphicFramePr>
@@ -24498,13 +24423,13 @@
               <a:graphicData uri="http://schemas.openxmlformats.org/drawingml/2006/picture">
                 <pic:pic xmlns:pic="http://schemas.openxmlformats.org/drawingml/2006/picture">
                   <pic:nvPicPr>
-                    <pic:cNvPr id="12" name="Picture 12"/>
+                    <pic:cNvPr id="11" name="Picture 11"/>
                     <pic:cNvPicPr>
                       <a:picLocks noChangeAspect="1" noChangeArrowheads="1"/>
                     </pic:cNvPicPr>
                   </pic:nvPicPr>
                   <pic:blipFill>
-                    <a:blip r:embed="rId16"/>
+                    <a:blip r:embed="rId15"/>
                     <a:stretch>
                       <a:fillRect/>
                     </a:stretch>
@@ -24556,7 +24481,7 @@
         <w:pStyle w:val="Heading2"/>
         <w:rPr/>
       </w:pPr>
-      <w:bookmarkStart w:id="35" w:name="__RefHeading___Toc2847_2791007604"/>
+      <w:bookmarkStart w:id="35" w:name="__RefHeading___Toc2842_4087052617"/>
       <w:bookmarkEnd w:id="35"/>
       <w:r>
         <w:rPr>
@@ -24733,7 +24658,7 @@
           <wp:inline distT="0" distB="0" distL="0" distR="0">
             <wp:extent cx="5939790" cy="3712845"/>
             <wp:effectExtent l="0" t="0" r="0" b="0"/>
-            <wp:docPr id="13" name="Picture 13"/>
+            <wp:docPr id="12" name="Picture 12"/>
             <wp:cNvGraphicFramePr>
               <a:graphicFrameLocks xmlns:a="http://schemas.openxmlformats.org/drawingml/2006/main" noChangeAspect="1"/>
             </wp:cNvGraphicFramePr>
@@ -24741,13 +24666,13 @@
               <a:graphicData uri="http://schemas.openxmlformats.org/drawingml/2006/picture">
                 <pic:pic xmlns:pic="http://schemas.openxmlformats.org/drawingml/2006/picture">
                   <pic:nvPicPr>
-                    <pic:cNvPr id="13" name="Picture 13"/>
+                    <pic:cNvPr id="12" name="Picture 12"/>
                     <pic:cNvPicPr>
                       <a:picLocks noChangeAspect="1" noChangeArrowheads="1"/>
                     </pic:cNvPicPr>
                   </pic:nvPicPr>
                   <pic:blipFill>
-                    <a:blip r:embed="rId17"/>
+                    <a:blip r:embed="rId16"/>
                     <a:stretch>
                       <a:fillRect/>
                     </a:stretch>
@@ -24808,7 +24733,7 @@
           <wp:inline distT="0" distB="0" distL="0" distR="0">
             <wp:extent cx="5939790" cy="3712845"/>
             <wp:effectExtent l="0" t="0" r="0" b="0"/>
-            <wp:docPr id="14" name="Picture 14"/>
+            <wp:docPr id="13" name="Picture 13"/>
             <wp:cNvGraphicFramePr>
               <a:graphicFrameLocks xmlns:a="http://schemas.openxmlformats.org/drawingml/2006/main" noChangeAspect="1"/>
             </wp:cNvGraphicFramePr>
@@ -24816,13 +24741,13 @@
               <a:graphicData uri="http://schemas.openxmlformats.org/drawingml/2006/picture">
                 <pic:pic xmlns:pic="http://schemas.openxmlformats.org/drawingml/2006/picture">
                   <pic:nvPicPr>
-                    <pic:cNvPr id="14" name="Picture 14"/>
+                    <pic:cNvPr id="13" name="Picture 13"/>
                     <pic:cNvPicPr>
                       <a:picLocks noChangeAspect="1" noChangeArrowheads="1"/>
                     </pic:cNvPicPr>
                   </pic:nvPicPr>
                   <pic:blipFill>
-                    <a:blip r:embed="rId18"/>
+                    <a:blip r:embed="rId17"/>
                     <a:stretch>
                       <a:fillRect/>
                     </a:stretch>
@@ -24874,7 +24799,7 @@
         <w:pStyle w:val="Heading2"/>
         <w:rPr/>
       </w:pPr>
-      <w:bookmarkStart w:id="36" w:name="__RefHeading___Toc2849_2791007604"/>
+      <w:bookmarkStart w:id="36" w:name="__RefHeading___Toc2844_4087052617"/>
       <w:bookmarkEnd w:id="36"/>
       <w:r>
         <w:rPr>
@@ -25022,7 +24947,7 @@
           <wp:inline distT="0" distB="0" distL="0" distR="0">
             <wp:extent cx="5939790" cy="3712845"/>
             <wp:effectExtent l="0" t="0" r="0" b="0"/>
-            <wp:docPr id="15" name="Picture 15"/>
+            <wp:docPr id="14" name="Picture 14"/>
             <wp:cNvGraphicFramePr>
               <a:graphicFrameLocks xmlns:a="http://schemas.openxmlformats.org/drawingml/2006/main" noChangeAspect="1"/>
             </wp:cNvGraphicFramePr>
@@ -25030,13 +24955,13 @@
               <a:graphicData uri="http://schemas.openxmlformats.org/drawingml/2006/picture">
                 <pic:pic xmlns:pic="http://schemas.openxmlformats.org/drawingml/2006/picture">
                   <pic:nvPicPr>
-                    <pic:cNvPr id="15" name="Picture 15"/>
+                    <pic:cNvPr id="14" name="Picture 14"/>
                     <pic:cNvPicPr>
                       <a:picLocks noChangeAspect="1" noChangeArrowheads="1"/>
                     </pic:cNvPicPr>
                   </pic:nvPicPr>
                   <pic:blipFill>
-                    <a:blip r:embed="rId19"/>
+                    <a:blip r:embed="rId18"/>
                     <a:stretch>
                       <a:fillRect/>
                     </a:stretch>
@@ -25097,7 +25022,7 @@
           <wp:inline distT="0" distB="0" distL="0" distR="0">
             <wp:extent cx="5939790" cy="3712845"/>
             <wp:effectExtent l="0" t="0" r="0" b="0"/>
-            <wp:docPr id="16" name="Picture 16"/>
+            <wp:docPr id="15" name="Picture 15"/>
             <wp:cNvGraphicFramePr>
               <a:graphicFrameLocks xmlns:a="http://schemas.openxmlformats.org/drawingml/2006/main" noChangeAspect="1"/>
             </wp:cNvGraphicFramePr>
@@ -25105,13 +25030,13 @@
               <a:graphicData uri="http://schemas.openxmlformats.org/drawingml/2006/picture">
                 <pic:pic xmlns:pic="http://schemas.openxmlformats.org/drawingml/2006/picture">
                   <pic:nvPicPr>
-                    <pic:cNvPr id="16" name="Picture 16"/>
+                    <pic:cNvPr id="15" name="Picture 15"/>
                     <pic:cNvPicPr>
                       <a:picLocks noChangeAspect="1" noChangeArrowheads="1"/>
                     </pic:cNvPicPr>
                   </pic:nvPicPr>
                   <pic:blipFill>
-                    <a:blip r:embed="rId20"/>
+                    <a:blip r:embed="rId19"/>
                     <a:stretch>
                       <a:fillRect/>
                     </a:stretch>
@@ -25163,7 +25088,7 @@
         <w:pStyle w:val="Heading2"/>
         <w:rPr/>
       </w:pPr>
-      <w:bookmarkStart w:id="37" w:name="__RefHeading___Toc2851_2791007604"/>
+      <w:bookmarkStart w:id="37" w:name="__RefHeading___Toc2846_4087052617"/>
       <w:bookmarkEnd w:id="37"/>
       <w:r>
         <w:rPr>
@@ -25223,7 +25148,7 @@
           <wp:inline distT="0" distB="0" distL="0" distR="0">
             <wp:extent cx="5939790" cy="2150745"/>
             <wp:effectExtent l="0" t="0" r="0" b="0"/>
-            <wp:docPr id="17" name="Picture 17"/>
+            <wp:docPr id="16" name="Picture 16"/>
             <wp:cNvGraphicFramePr>
               <a:graphicFrameLocks xmlns:a="http://schemas.openxmlformats.org/drawingml/2006/main" noChangeAspect="1"/>
             </wp:cNvGraphicFramePr>
@@ -25231,13 +25156,13 @@
               <a:graphicData uri="http://schemas.openxmlformats.org/drawingml/2006/picture">
                 <pic:pic xmlns:pic="http://schemas.openxmlformats.org/drawingml/2006/picture">
                   <pic:nvPicPr>
-                    <pic:cNvPr id="17" name="Picture 17"/>
+                    <pic:cNvPr id="16" name="Picture 16"/>
                     <pic:cNvPicPr>
                       <a:picLocks noChangeAspect="1" noChangeArrowheads="1"/>
                     </pic:cNvPicPr>
                   </pic:nvPicPr>
                   <pic:blipFill>
-                    <a:blip r:embed="rId21"/>
+                    <a:blip r:embed="rId20"/>
                     <a:stretch>
                       <a:fillRect/>
                     </a:stretch>
@@ -25289,7 +25214,7 @@
         <w:pStyle w:val="Heading3"/>
         <w:rPr/>
       </w:pPr>
-      <w:bookmarkStart w:id="38" w:name="__RefHeading___Toc2853_2791007604"/>
+      <w:bookmarkStart w:id="38" w:name="__RefHeading___Toc2848_4087052617"/>
       <w:bookmarkEnd w:id="38"/>
       <w:r>
         <w:rPr>
@@ -25458,7 +25383,7 @@
         <w:pStyle w:val="Heading3"/>
         <w:rPr/>
       </w:pPr>
-      <w:bookmarkStart w:id="39" w:name="__RefHeading___Toc2855_2791007604"/>
+      <w:bookmarkStart w:id="39" w:name="__RefHeading___Toc2850_4087052617"/>
       <w:bookmarkEnd w:id="39"/>
       <w:r>
         <w:rPr>
@@ -25509,7 +25434,7 @@
         <w:pStyle w:val="Heading3"/>
         <w:rPr/>
       </w:pPr>
-      <w:bookmarkStart w:id="40" w:name="__RefHeading___Toc2857_2791007604"/>
+      <w:bookmarkStart w:id="40" w:name="__RefHeading___Toc2852_4087052617"/>
       <w:bookmarkEnd w:id="40"/>
       <w:r>
         <w:rPr>
@@ -26378,7 +26303,7 @@
         <w:pStyle w:val="Heading3"/>
         <w:rPr/>
       </w:pPr>
-      <w:bookmarkStart w:id="41" w:name="__RefHeading___Toc2859_2791007604"/>
+      <w:bookmarkStart w:id="41" w:name="__RefHeading___Toc2854_4087052617"/>
       <w:bookmarkEnd w:id="41"/>
       <w:r>
         <w:rPr>
@@ -26958,7 +26883,7 @@
         <w:pStyle w:val="Heading1"/>
         <w:rPr/>
       </w:pPr>
-      <w:bookmarkStart w:id="42" w:name="__RefHeading___Toc2861_2791007604"/>
+      <w:bookmarkStart w:id="42" w:name="__RefHeading___Toc2856_4087052617"/>
       <w:bookmarkEnd w:id="42"/>
       <w:r>
         <w:rPr>
@@ -26976,7 +26901,7 @@
         <w:pStyle w:val="Heading2"/>
         <w:rPr/>
       </w:pPr>
-      <w:bookmarkStart w:id="43" w:name="__RefHeading___Toc2863_2791007604"/>
+      <w:bookmarkStart w:id="43" w:name="__RefHeading___Toc2858_4087052617"/>
       <w:bookmarkEnd w:id="43"/>
       <w:r>
         <w:rPr>
@@ -27615,7 +27540,7 @@
         <w:pStyle w:val="Heading2"/>
         <w:rPr/>
       </w:pPr>
-      <w:bookmarkStart w:id="44" w:name="__RefHeading___Toc2865_2791007604"/>
+      <w:bookmarkStart w:id="44" w:name="__RefHeading___Toc2860_4087052617"/>
       <w:bookmarkEnd w:id="44"/>
       <w:r>
         <w:rPr>
@@ -28357,7 +28282,7 @@
           <w:i w:val="false"/>
           <w:sz w:val="26"/>
         </w:rPr>
-        <w:t>Giới hạn cần lưu ý: kịch bản lifecycle.e2e-spec.ts hiện chỉ chạy trọn vòng đời khi có khung giờ trong cửa sổ check-in tại thời điểm chạy; ngoài giờ, nhánh này trả về sớm. Vì vậy số test đạt không chứng minh mọi tiêu chí vòng đời đã được thực thi trong lần chạy này; cần kiểm tra thủ công theo DEMO-SCRIPT hoặc chuẩn bị fixture thời gian độc lập trước khi nghiệm thu.</w:t>
+        <w:t>Kịch bản vòng đời chọn dịch vụ seed cố định và ca mẫu còn trống; đồng hồ tạo Date được cố định trong giai đoạn check-in / bắt đầu / hoàn tất, trong khi JWT và timer mạng dùng thời gian thật. Test chạy trọn đến thanh toán, đóng phiếu, đánh giá và đối chiếu doanh thu; không trả về sớm khi chạy ngoài giờ mở cửa. AC về bố cục di động, thao tác UI và thời hạn email vẫn cần tester ghi Pass/Fail theo DEMO-SCRIPT trước khi nghiệm thu.</w:t>
       </w:r>
     </w:p>
     <w:p>
@@ -28365,7 +28290,7 @@
         <w:pStyle w:val="Heading2"/>
         <w:rPr/>
       </w:pPr>
-      <w:bookmarkStart w:id="45" w:name="__RefHeading___Toc2867_2791007604"/>
+      <w:bookmarkStart w:id="45" w:name="__RefHeading___Toc2862_4087052617"/>
       <w:bookmarkEnd w:id="45"/>
       <w:r>
         <w:rPr>
@@ -28373,7 +28298,7 @@
           <w:b/>
           <w:sz w:val="28"/>
         </w:rPr>
-        <w:t>5.3. Kết quả nghiệm thu</w:t>
+        <w:t>5.3. Kết quả đối chiếu User Story</w:t>
       </w:r>
     </w:p>
     <w:p>
@@ -28399,7 +28324,7 @@
           <w:i/>
           <w:sz w:val="26"/>
         </w:rPr>
-        <w:t>Kết quả nghiệm thu theo Epic</w:t>
+        <w:t>Kết quả đối chiếu theo Epic</w:t>
       </w:r>
     </w:p>
     <w:tbl>
@@ -29574,7 +29499,7 @@
         <w:pStyle w:val="Heading2"/>
         <w:rPr/>
       </w:pPr>
-      <w:bookmarkStart w:id="46" w:name="__RefHeading___Toc2869_2791007604"/>
+      <w:bookmarkStart w:id="46" w:name="__RefHeading___Toc2864_4087052617"/>
       <w:bookmarkEnd w:id="46"/>
       <w:r>
         <w:rPr>
@@ -29590,7 +29515,7 @@
         <w:pStyle w:val="Heading3"/>
         <w:rPr/>
       </w:pPr>
-      <w:bookmarkStart w:id="47" w:name="__RefHeading___Toc2871_2791007604"/>
+      <w:bookmarkStart w:id="47" w:name="__RefHeading___Toc2866_4087052617"/>
       <w:bookmarkEnd w:id="47"/>
       <w:r>
         <w:rPr>
@@ -29619,7 +29544,7 @@
           <w:i w:val="false"/>
           <w:sz w:val="26"/>
         </w:rPr>
-        <w:t>Hoàn thành 100% Product Backlog (39 story / 165 point) trong 4 Sprint.</w:t>
+        <w:t>Đối chiếu đủ phạm vi Product Backlog: 39 story / 165 point trong 4 Sprint.</w:t>
       </w:r>
     </w:p>
     <w:p>
@@ -29707,7 +29632,7 @@
         <w:pStyle w:val="Heading3"/>
         <w:rPr/>
       </w:pPr>
-      <w:bookmarkStart w:id="48" w:name="__RefHeading___Toc2873_2791007604"/>
+      <w:bookmarkStart w:id="48" w:name="__RefHeading___Toc2868_4087052617"/>
       <w:bookmarkEnd w:id="48"/>
       <w:r>
         <w:rPr>
@@ -29804,7 +29729,7 @@
         <w:pStyle w:val="Heading2"/>
         <w:rPr/>
       </w:pPr>
-      <w:bookmarkStart w:id="49" w:name="__RefHeading___Toc2875_2791007604"/>
+      <w:bookmarkStart w:id="49" w:name="__RefHeading___Toc2870_4087052617"/>
       <w:bookmarkEnd w:id="49"/>
       <w:r>
         <w:rPr>
@@ -29920,7 +29845,7 @@
         <w:pStyle w:val="Heading2"/>
         <w:rPr/>
       </w:pPr>
-      <w:bookmarkStart w:id="50" w:name="__RefHeading___Toc2877_2791007604"/>
+      <w:bookmarkStart w:id="50" w:name="__RefHeading___Toc2872_4087052617"/>
       <w:bookmarkEnd w:id="50"/>
       <w:r>
         <w:rPr>
@@ -29963,7 +29888,7 @@
           <w:i w:val="false"/>
           <w:sz w:val="26"/>
         </w:rPr>
-        <w:t xml:space="preserve"> đáp ứng toàn bộ 39 user story đã được PO phê duyệt. Hệ thống giải quyết trực tiếp những vấn đề của cách quản lý thủ công: khách tự đặt lịch 24/7 theo đúng khung giờ thợ rảnh, không còn chồng lịch nhờ ba lớp bảo vệ đồng thời, lễ tân điều phối trực quan, doanh thu minh bạch và có nhật ký không thể xoá.</w:t>
+        <w:t xml:space="preserve"> đáp ứng phạm vi 39 user story trong đề tài gốc. Hệ thống giải quyết trực tiếp những vấn đề của cách quản lý thủ công: khách tự đặt lịch 24/7 theo đúng khung giờ thợ rảnh, không còn chồng lịch nhờ ba lớp bảo vệ đồng thời, lễ tân điều phối trực quan, doanh thu minh bạch và có nhật ký không thể xoá.</w:t>
       </w:r>
     </w:p>
     <w:p>
@@ -29988,7 +29913,7 @@
         <w:pStyle w:val="Heading1"/>
         <w:rPr/>
       </w:pPr>
-      <w:bookmarkStart w:id="51" w:name="__RefHeading___Toc2879_2791007604"/>
+      <w:bookmarkStart w:id="51" w:name="__RefHeading___Toc2874_4087052617"/>
       <w:bookmarkEnd w:id="51"/>
       <w:r>
         <w:rPr>
@@ -30191,9 +30116,9 @@
       </w:r>
     </w:p>
     <w:sectPr>
-      <w:headerReference w:type="even" r:id="rId22"/>
-      <w:headerReference w:type="default" r:id="rId23"/>
-      <w:headerReference w:type="first" r:id="rId24"/>
+      <w:headerReference w:type="even" r:id="rId21"/>
+      <w:headerReference w:type="default" r:id="rId22"/>
+      <w:headerReference w:type="first" r:id="rId23"/>
       <w:type w:val="nextPage"/>
       <w:pgSz w:w="11906" w:h="16838"/>
       <w:pgMar w:left="1701" w:right="850" w:gutter="0" w:header="567" w:top="1134" w:footer="0" w:bottom="1134"/>
@@ -30362,7 +30287,7 @@
         <w:rFonts w:eastAsia="Times New Roman" w:cs="Times New Roman"/>
         <w:sz w:val="26"/>
       </w:rPr>
-      <w:t>39</w:t>
+      <w:t>38</w:t>
     </w:r>
     <w:r>
       <w:rPr>
@@ -30409,7 +30334,7 @@
         <w:rFonts w:eastAsia="Times New Roman" w:cs="Times New Roman"/>
         <w:sz w:val="26"/>
       </w:rPr>
-      <w:t>39</w:t>
+      <w:t>38</w:t>
     </w:r>
     <w:r>
       <w:rPr>

</xml_diff>